<commit_message>
docs(bd): IPD dossier follow-up - EXPO Centre SE identified (Eng-Spire), FS7 delay
Municipal-records check: Eng-Spire confirmed as EXPO Centre structural
engineer (own project page + Delnor/ACI corroboration) - Alberta IPD SE
field widens to four firms; Strathcona FS7 award unannounced, opening
moved to mid-2029 per county Budget 2026 release. Fieldhouse SE remains
behind the eScribe portal (browser check = concrete next step).

Co-Authored-By: Claude Fable 5 <noreply@anthropic.com>
</commit_message>
<xml_diff>
--- a/docs/KOR-IPD-Alberta-BC-2026-07-03.docx
+++ b/docs/KOR-IPD-Alberta-BC-2026-07-03.docx
@@ -73,7 +73,7 @@
     </w:p>
     <w:p>
       <w:r>
-        <w:pict w14:anchorId="72D362FC">
+        <w:pict w14:anchorId="44121D73">
           <v:rect id="_x0000_i1025" style="width:0;height:1.5pt" o:hralign="center" o:hrstd="t" o:hr="t"/>
         </w:pict>
       </w:r>
@@ -177,7 +177,7 @@
         <w:t xml:space="preserve"> </w:t>
       </w:r>
       <w:r>
-        <w:t xml:space="preserve">(its alternative-delivery play is P3). The structural seats belong to </w:t>
+        <w:t xml:space="preserve">(its alternative-delivery play is P3). The structural seats belong overwhelmingly to </w:t>
       </w:r>
       <w:r>
         <w:rPr>
@@ -187,7 +187,7 @@
         <w:t>RJC</w:t>
       </w:r>
       <w:r>
-        <w:t xml:space="preserve"> (dominant — at least five corroborated projects, seven on its own roster, with named regional IPD leads) and Entuitive. [V]</w:t>
+        <w:t xml:space="preserve"> (at least five corroborated projects, seven on its own roster, with named regional IPD leads), with single projects held by Entuitive, Eng-Spire, and Fast+Epp. [V]</w:t>
       </w:r>
     </w:p>
     <w:p>
@@ -248,11 +248,11 @@
         <w:t>municipal work — where owners procure the structural engineer directly</w:t>
       </w:r>
       <w:r>
-        <w:t xml:space="preserve"> (Penticton posted a standalone “Structural Consultant: IPD” RFP in 2026). The big </w:t>
+        <w:t xml:space="preserve"> </w:t>
       </w:r>
       <w:r>
         <w:lastRenderedPageBreak/>
-        <w:t xml:space="preserve">BC collaborative wave is the </w:t>
+        <w:t xml:space="preserve">(Penticton posted a standalone “Structural Consultant: IPD” RFP in 2026). The big BC collaborative wave is the </w:t>
       </w:r>
       <w:r>
         <w:rPr>
@@ -618,33 +618,14 @@
               <w:rPr>
                 <w:sz w:val="17"/>
               </w:rPr>
-              <w:t>KOR’s contract is with</w:t>
-            </w:r>
-          </w:p>
-        </w:tc>
-        <w:tc>
-          <w:tcPr>
-            <w:tcW w:w="1000" w:type="pct"/>
-          </w:tcPr>
-          <w:p>
-            <w:pPr>
-              <w:pStyle w:val="Compact"/>
-              <w:rPr>
-                <w:sz w:val="17"/>
-              </w:rPr>
-            </w:pPr>
-            <w:r>
-              <w:rPr>
-                <w:sz w:val="17"/>
-              </w:rPr>
-              <w:t xml:space="preserve">The architect (who holds the </w:t>
+              <w:t xml:space="preserve">KOR’s contract </w:t>
             </w:r>
             <w:r>
               <w:rPr>
                 <w:sz w:val="17"/>
               </w:rPr>
               <w:lastRenderedPageBreak/>
-              <w:t>owner contract)</w:t>
+              <w:t>is with</w:t>
             </w:r>
           </w:p>
         </w:tc>
@@ -664,14 +645,41 @@
                 <w:sz w:val="17"/>
               </w:rPr>
               <w:lastRenderedPageBreak/>
-              <w:t xml:space="preserve">The design-builder </w:t>
+              <w:t xml:space="preserve">The architect </w:t>
             </w:r>
             <w:r>
               <w:rPr>
                 <w:sz w:val="17"/>
               </w:rPr>
               <w:lastRenderedPageBreak/>
-              <w:t>(contractor)</w:t>
+              <w:t>(who holds the owner contract)</w:t>
+            </w:r>
+          </w:p>
+        </w:tc>
+        <w:tc>
+          <w:tcPr>
+            <w:tcW w:w="1000" w:type="pct"/>
+          </w:tcPr>
+          <w:p>
+            <w:pPr>
+              <w:pStyle w:val="Compact"/>
+              <w:rPr>
+                <w:sz w:val="17"/>
+              </w:rPr>
+            </w:pPr>
+            <w:r>
+              <w:rPr>
+                <w:sz w:val="17"/>
+              </w:rPr>
+              <w:lastRenderedPageBreak/>
+              <w:t>The design-</w:t>
+            </w:r>
+            <w:r>
+              <w:rPr>
+                <w:sz w:val="17"/>
+              </w:rPr>
+              <w:lastRenderedPageBreak/>
+              <w:t>builder (contractor)</w:t>
             </w:r>
           </w:p>
         </w:tc>
@@ -693,7 +701,7 @@
                 <w:sz w:val="17"/>
               </w:rPr>
               <w:lastRenderedPageBreak/>
-              <w:t xml:space="preserve">Everyone — one multi-party </w:t>
+              <w:t xml:space="preserve">Everyone — </w:t>
             </w:r>
             <w:r>
               <w:rPr>
@@ -702,7 +710,7 @@
                 <w:sz w:val="17"/>
               </w:rPr>
               <w:lastRenderedPageBreak/>
-              <w:t>contract</w:t>
+              <w:t>one multi-party contract</w:t>
             </w:r>
             <w:r>
               <w:rPr>
@@ -728,14 +736,14 @@
                 <w:sz w:val="17"/>
               </w:rPr>
               <w:lastRenderedPageBreak/>
-              <w:t xml:space="preserve">Not signed by engineers — </w:t>
+              <w:t xml:space="preserve">Not signed by </w:t>
             </w:r>
             <w:r>
               <w:rPr>
                 <w:sz w:val="17"/>
               </w:rPr>
               <w:lastRenderedPageBreak/>
-              <w:t>KOR would subcontract to a signatory (architect or contractor)</w:t>
+              <w:t>engineers — KOR would subcontract to a signatory (architect or contractor)</w:t>
             </w:r>
           </w:p>
         </w:tc>
@@ -1214,7 +1222,14 @@
               <w:rPr>
                 <w:sz w:val="17"/>
               </w:rPr>
-              <w:t>Contractor precon relationships</w:t>
+              <w:t xml:space="preserve">Contractor precon </w:t>
+            </w:r>
+            <w:r>
+              <w:rPr>
+                <w:sz w:val="17"/>
+              </w:rPr>
+              <w:lastRenderedPageBreak/>
+              <w:t>relationships</w:t>
             </w:r>
           </w:p>
         </w:tc>
@@ -1235,7 +1250,8 @@
                 <w:bCs/>
                 <w:sz w:val="17"/>
               </w:rPr>
-              <w:t xml:space="preserve">Sponsor relationship with the </w:t>
+              <w:lastRenderedPageBreak/>
+              <w:t xml:space="preserve">Sponsor relationship </w:t>
             </w:r>
             <w:r>
               <w:rPr>
@@ -1244,7 +1260,7 @@
                 <w:sz w:val="17"/>
               </w:rPr>
               <w:lastRenderedPageBreak/>
-              <w:t>contractor/architect core + culture-fit interview</w:t>
+              <w:t>with the contractor/architect core + culture-fit interview</w:t>
             </w:r>
           </w:p>
         </w:tc>
@@ -1264,14 +1280,14 @@
                 <w:sz w:val="17"/>
               </w:rPr>
               <w:lastRenderedPageBreak/>
-              <w:t xml:space="preserve">Architect/GC pursuit-team relationships </w:t>
+              <w:t xml:space="preserve">Architect/GC pursuit-team </w:t>
             </w:r>
             <w:r>
               <w:rPr>
                 <w:sz w:val="17"/>
               </w:rPr>
               <w:lastRenderedPageBreak/>
-              <w:t>(the existing playbook)</w:t>
+              <w:t>relationships (the existing playbook)</w:t>
             </w:r>
           </w:p>
         </w:tc>
@@ -1906,60 +1922,45 @@
               <w:rPr>
                 <w:sz w:val="17"/>
               </w:rPr>
-              <w:t xml:space="preserve">St. Lorenzo Ruiz </w:t>
-            </w:r>
-            <w:r>
-              <w:rPr>
-                <w:sz w:val="17"/>
-              </w:rPr>
               <w:lastRenderedPageBreak/>
-              <w:t>School, Red Deer</w:t>
-            </w:r>
-          </w:p>
-        </w:tc>
-        <w:tc>
-          <w:tcPr>
-            <w:tcW w:w="1000" w:type="pct"/>
-          </w:tcPr>
-          <w:p>
-            <w:pPr>
-              <w:pStyle w:val="Compact"/>
-              <w:rPr>
-                <w:sz w:val="17"/>
-              </w:rPr>
-            </w:pPr>
-            <w:r>
-              <w:rPr>
-                <w:sz w:val="17"/>
-              </w:rPr>
-              <w:lastRenderedPageBreak/>
-              <w:t xml:space="preserve">Red Deer </w:t>
-            </w:r>
-            <w:r>
-              <w:rPr>
-                <w:sz w:val="17"/>
-              </w:rPr>
-              <w:lastRenderedPageBreak/>
-              <w:t>Catholic</w:t>
-            </w:r>
-          </w:p>
-        </w:tc>
-        <w:tc>
-          <w:tcPr>
-            <w:tcW w:w="1000" w:type="pct"/>
-          </w:tcPr>
-          <w:p>
-            <w:pPr>
-              <w:pStyle w:val="Compact"/>
-              <w:rPr>
-                <w:sz w:val="17"/>
-              </w:rPr>
-            </w:pPr>
-            <w:r>
-              <w:rPr>
-                <w:sz w:val="17"/>
-              </w:rPr>
-              <w:lastRenderedPageBreak/>
+              <w:t>St. Lorenzo Ruiz School, Red Deer</w:t>
+            </w:r>
+          </w:p>
+        </w:tc>
+        <w:tc>
+          <w:tcPr>
+            <w:tcW w:w="1000" w:type="pct"/>
+          </w:tcPr>
+          <w:p>
+            <w:pPr>
+              <w:pStyle w:val="Compact"/>
+              <w:rPr>
+                <w:sz w:val="17"/>
+              </w:rPr>
+            </w:pPr>
+            <w:r>
+              <w:rPr>
+                <w:sz w:val="17"/>
+              </w:rPr>
+              <w:t>Red Deer Catholic</w:t>
+            </w:r>
+          </w:p>
+        </w:tc>
+        <w:tc>
+          <w:tcPr>
+            <w:tcW w:w="1000" w:type="pct"/>
+          </w:tcPr>
+          <w:p>
+            <w:pPr>
+              <w:pStyle w:val="Compact"/>
+              <w:rPr>
+                <w:sz w:val="17"/>
+              </w:rPr>
+            </w:pPr>
+            <w:r>
+              <w:rPr>
+                <w:sz w:val="17"/>
+              </w:rPr>
               <w:t>Clark Builders</w:t>
             </w:r>
           </w:p>
@@ -2406,9 +2407,11 @@
             </w:pPr>
             <w:r>
               <w:rPr>
-                <w:sz w:val="17"/>
-              </w:rPr>
-              <w:t>—</w:t>
+                <w:b/>
+                <w:bCs/>
+                <w:sz w:val="17"/>
+              </w:rPr>
+              <w:t>Eng-Spire</w:t>
             </w:r>
           </w:p>
         </w:tc>
@@ -2754,14 +2757,14 @@
               <w:rPr>
                 <w:sz w:val="17"/>
               </w:rPr>
-              <w:t xml:space="preserve">(posting AB-2025-05615; required an architect, GC, structural consultant and structural trade on a cost-plus-profit-at-risk </w:t>
+              <w:t xml:space="preserve">(posting AB-2025-05615; required an architect, GC, structural consultant and structural trade </w:t>
             </w:r>
             <w:r>
               <w:rPr>
                 <w:sz w:val="17"/>
               </w:rPr>
               <w:lastRenderedPageBreak/>
-              <w:t>IPD agreement)</w:t>
+              <w:t>on a cost-plus-profit-at-risk IPD agreement)</w:t>
             </w:r>
           </w:p>
         </w:tc>
@@ -2858,10 +2861,20 @@
         <w:t>The incumbency:</w:t>
       </w:r>
       <w:r>
+        <w:t xml:space="preserve"> RJC is the structural incumbent by a wide margin (its own published Alberta IPD roster lists seven projects; at least five are independently corroborated), with named regional IPD leads (Pat Elischer, Jeff Rabinovitch, Kumbo Mwanan’gonze). Entuitive holds one (Garth Worthington), </w:t>
+      </w:r>
+      <w:r>
+        <w:rPr>
+          <w:b/>
+          <w:bCs/>
+        </w:rPr>
+        <w:t>Eng-Spire</w:t>
+      </w:r>
+      <w:r>
         <w:t xml:space="preserve"> </w:t>
       </w:r>
       <w:r>
-        <w:t xml:space="preserve">RJC is the structural incumbent by a wide margin (its own published Alberta IPD roster lists seven projects; at least five are independently corroborated), with named regional IPD leads (Pat Elischer, Jeff Rabinovitch, Kumbo Mwanan’gonze). Entuitive holds one. No other structural firm was confirmed on any Alberta IPD team. </w:t>
+        <w:t xml:space="preserve">holds one (the EXPO Centre — confirmed on its own project page and the Delnor/ACI team pages), and Fast+Epp held the first (Mosaic). Four firms total — a wider field than “RJC owns it,” and proof the seat is winnable project-by-project. </w:t>
       </w:r>
       <w:r>
         <w:rPr>
@@ -3661,15 +3674,15 @@
         <w:pStyle w:val="FirstParagraph"/>
       </w:pPr>
       <w:r>
-        <w:t>The structural engineer on Strathcona Fieldhouse and Edmonton EXPO Centre (never publicly named); CCDC 30’s actual contract text (paywalled — all mechanics herein rest on 2+ corroborating secondary sources each; hence action 2); any SE-specific profit outcome on a Canadian IPD project (none published); the EPCOR Biogas IPD RFP (single-source lead); Vancouver Firehalls 2 &amp; 9 as IPD (rumour); DIALOG’s unannounced pursuits; the exact contract path of sub-tier consultants on BC alliance hospitals (e.g., the str</w:t>
-      </w:r>
-      <w:r>
-        <w:t>uctural engineer’s terms on Cowichan sit below the published signing tier); three Alberta school projects attributed to the IPD program on inference only (Alex Janvier, East Chappelle, Morrin).</w:t>
+        <w:t>The structural engineer on Strathcona Fieldhouse (county communications never itemize engineering disciplines — the award staff report on the county’s meeting portal would name it; a browser check of Q1–Q2 2024 agendas is the concrete next step); the Fire Station 7 award (unannounced as of 2026-07-03; the county’s Budget 2026 release moved the station’s opening from 2028 to mid-2029); CCDC 30’s actual contract text (paywalled — all mechanics herein rest on 2+ corroborating secondary sources each; hence acti</w:t>
+      </w:r>
+      <w:r>
+        <w:t>on 2); any SE-specific profit outcome on a Canadian IPD project (none published); the EPCOR Biogas IPD RFP (single-source lead); Vancouver Firehalls 2 &amp; 9 as IPD (rumour); DIALOG’s unannounced pursuits; the exact contract path of sub-tier consultants on BC alliance hospitals (e.g., the structural engineer’s terms on Cowichan sit below the published signing tier); three Alberta school projects attributed to the IPD program on inference only (Alex Janvier, East Chappelle, Morrin).</w:t>
       </w:r>
     </w:p>
     <w:p>
       <w:r>
-        <w:pict w14:anchorId="328962D8">
+        <w:pict w14:anchorId="06009362">
           <v:rect id="_x0000_i1026" style="width:0;height:1.5pt" o:hralign="center" o:hrstd="t" o:hr="t"/>
         </w:pict>
       </w:r>
@@ -3719,7 +3732,7 @@
           <w:i/>
           <w:iCs/>
         </w:rPr>
-        <w:t>resolved from the underlying sources (Graham’s confirmed IPD is civil work; Bird’s is via the Chandos-Bird joint venture; RJC’s count is five corroborated of seven self-reported). Prepared 2026-07-03.</w:t>
+        <w:t>resolved from the underlying sources (Graham’s confirmed IPD is civil work; Bird’s is via the Chandos-Bird joint venture; RJC’s count is five corroborated of seven self-reported). A same-day follow-up check of municipal records identified the EXPO Centre structural engineer (Eng-Spire) and confirmed the Fire Station 7 award remained unannounced, with the station’s opening moved to mid-2029. Prepared 2026-07-03.</w:t>
       </w:r>
       <w:bookmarkEnd w:id="0"/>
       <w:bookmarkEnd w:id="10"/>
@@ -3742,7 +3755,7 @@
   <w:abstractNum w:abstractNumId="0" w15:restartNumberingAfterBreak="0">
     <w:nsid w:val="0000A990"/>
     <w:multiLevelType w:val="multilevel"/>
-    <w:tmpl w:val="CE0EA470"/>
+    <w:tmpl w:val="8EF61F92"/>
     <w:lvl w:ilvl="0">
       <w:numFmt w:val="bullet"/>
       <w:lvlText w:val=" "/>
@@ -3819,7 +3832,7 @@
   <w:abstractNum w:abstractNumId="1" w15:restartNumberingAfterBreak="0">
     <w:nsid w:val="0000A991"/>
     <w:multiLevelType w:val="multilevel"/>
-    <w:tmpl w:val="B2063598"/>
+    <w:tmpl w:val="E3A4907E"/>
     <w:lvl w:ilvl="0">
       <w:numFmt w:val="bullet"/>
       <w:lvlText w:val=""/>
@@ -3923,7 +3936,7 @@
   <w:abstractNum w:abstractNumId="2" w15:restartNumberingAfterBreak="0">
     <w:nsid w:val="00A99411"/>
     <w:multiLevelType w:val="multilevel"/>
-    <w:tmpl w:val="57421684"/>
+    <w:tmpl w:val="C986C74C"/>
     <w:lvl w:ilvl="0">
       <w:start w:val="1"/>
       <w:numFmt w:val="decimal"/>
@@ -4006,10 +4019,10 @@
       </w:pPr>
     </w:lvl>
   </w:abstractNum>
-  <w:num w:numId="1" w16cid:durableId="1108232423">
+  <w:num w:numId="1" w16cid:durableId="691760814">
     <w:abstractNumId w:val="0"/>
   </w:num>
-  <w:num w:numId="2" w16cid:durableId="422848720">
+  <w:num w:numId="2" w16cid:durableId="2039889415">
     <w:abstractNumId w:val="2"/>
     <w:lvlOverride w:ilvl="0">
       <w:startOverride w:val="1"/>
@@ -4039,19 +4052,19 @@
       <w:startOverride w:val="1"/>
     </w:lvlOverride>
   </w:num>
-  <w:num w:numId="3" w16cid:durableId="1149907372">
+  <w:num w:numId="3" w16cid:durableId="1502037811">
     <w:abstractNumId w:val="1"/>
   </w:num>
-  <w:num w:numId="4" w16cid:durableId="1415667995">
+  <w:num w:numId="4" w16cid:durableId="1545798094">
     <w:abstractNumId w:val="1"/>
   </w:num>
-  <w:num w:numId="5" w16cid:durableId="2035419299">
+  <w:num w:numId="5" w16cid:durableId="1340693811">
     <w:abstractNumId w:val="1"/>
   </w:num>
-  <w:num w:numId="6" w16cid:durableId="1077630867">
+  <w:num w:numId="6" w16cid:durableId="16398233">
     <w:abstractNumId w:val="1"/>
   </w:num>
-  <w:num w:numId="7" w16cid:durableId="897400505">
+  <w:num w:numId="7" w16cid:durableId="133838600">
     <w:abstractNumId w:val="2"/>
     <w:lvlOverride w:ilvl="0">
       <w:startOverride w:val="1"/>
@@ -5315,7 +5328,7 @@
     <w:name w:val="Grid Table 4"/>
     <w:basedOn w:val="TableNormal"/>
     <w:uiPriority w:val="49"/>
-    <w:rsid w:val="00F95F64"/>
+    <w:rsid w:val="00936431"/>
     <w:pPr>
       <w:spacing w:after="0"/>
     </w:pPr>

</xml_diff>

<commit_message>
docs(bd): IPD dossier reissue - call-list table added to Section 5
Nine outreach contacts from the 2026-07-03 enrichment pass with honest
verification labels (verified / pattern-inferred); competitor contacts
noted as database-only. Reissue approved by Ian with the Eng-Spire/FS7
follow-up note.

Co-Authored-By: Claude Fable 5 <noreply@anthropic.com>
</commit_message>
<xml_diff>
--- a/docs/KOR-IPD-Alberta-BC-2026-07-03.docx
+++ b/docs/KOR-IPD-Alberta-BC-2026-07-03.docx
@@ -73,7 +73,7 @@
     </w:p>
     <w:p>
       <w:r>
-        <w:pict w14:anchorId="44121D73">
+        <w:pict w14:anchorId="5C180903">
           <v:rect id="_x0000_i1025" style="width:0;height:1.5pt" o:hralign="center" o:hrstd="t" o:hr="t"/>
         </w:pict>
       </w:r>
@@ -3115,50 +3115,773 @@
           <w:b/>
           <w:bCs/>
         </w:rPr>
-        <w:t>How a first-timer gets in (documented cases):</w:t>
-      </w:r>
-      <w:r>
-        <w:t xml:space="preserve"> owners mandate IPD → the contractor/architect core cascade-selects consultants → selection interviews test collaborative behaviour and culture fit, not IPD résumé; </w:t>
-      </w:r>
-      <w:r>
-        <w:rPr>
-          <w:b/>
-          <w:bCs/>
-        </w:rPr>
-        <w:t>training comes after selection</w:t>
-      </w:r>
-      <w:r>
-        <w:t xml:space="preserve">. One Alberta RFP (Strathcona Fire Station 7) required the structural engineer named on the team at submission — meaning the relationship must exist </w:t>
-      </w:r>
-      <w:r>
-        <w:rPr>
-          <w:i/>
-          <w:iCs/>
-        </w:rPr>
-        <w:t>before</w:t>
-      </w:r>
-      <w:r>
-        <w:t xml:space="preserve"> the posting. The realistic KOR path: </w:t>
-      </w:r>
-      <w:r>
-        <w:rPr>
-          <w:b/>
-          <w:bCs/>
-        </w:rPr>
-        <w:t>APEGA Permit to Practice first</w:t>
-      </w:r>
-      <w:r>
-        <w:t xml:space="preserve"> (hard prerequisite, already on KOR’s Alberta list) → IPDA membership + Edmonton Lean Coffee presence → conventional work or genuine relationships with Chandos/Delnor/Clark and ACI/Group2 → be the seismic/mass-timber-capable option RJC isn’t when the next team forms.</w:t>
+        <w:t>The call list</w:t>
+      </w:r>
+      <w:r>
+        <w:t xml:space="preserve"> (contact details verified 2026-07-03 unless labeled; pattern-inferred addresses match each firm’s confirmed email format but are unconfirmed — verify before relying on them):</w:t>
       </w:r>
     </w:p>
+    <w:tbl>
+      <w:tblPr>
+        <w:tblStyle w:val="GridTable4"/>
+        <w:tblW w:w="5000" w:type="pct"/>
+        <w:tblCellMar>
+          <w:top w:w="40" w:type="dxa"/>
+          <w:left w:w="100" w:type="dxa"/>
+          <w:bottom w:w="40" w:type="dxa"/>
+          <w:right w:w="100" w:type="dxa"/>
+        </w:tblCellMar>
+        <w:tblLook w:val="0420" w:firstRow="1" w:lastRow="0" w:firstColumn="0" w:lastColumn="0" w:noHBand="0" w:noVBand="1"/>
+      </w:tblPr>
+      <w:tblGrid>
+        <w:gridCol w:w="3480"/>
+        <w:gridCol w:w="3481"/>
+        <w:gridCol w:w="3479"/>
+      </w:tblGrid>
+      <w:tr>
+        <w:trPr>
+          <w:cnfStyle w:val="100000000000" w:firstRow="1" w:lastRow="0" w:firstColumn="0" w:lastColumn="0" w:oddVBand="0" w:evenVBand="0" w:oddHBand="0" w:evenHBand="0" w:firstRowFirstColumn="0" w:firstRowLastColumn="0" w:lastRowFirstColumn="0" w:lastRowLastColumn="0"/>
+          <w:cantSplit/>
+          <w:tblHeader/>
+        </w:trPr>
+        <w:tc>
+          <w:tcPr>
+            <w:tcW w:w="1667" w:type="pct"/>
+          </w:tcPr>
+          <w:p>
+            <w:pPr>
+              <w:pStyle w:val="Compact"/>
+              <w:rPr>
+                <w:b w:val="0"/>
+                <w:sz w:val="17"/>
+              </w:rPr>
+            </w:pPr>
+            <w:r>
+              <w:rPr>
+                <w:b w:val="0"/>
+                <w:sz w:val="17"/>
+              </w:rPr>
+              <w:t>Person</w:t>
+            </w:r>
+          </w:p>
+        </w:tc>
+        <w:tc>
+          <w:tcPr>
+            <w:tcW w:w="1667" w:type="pct"/>
+          </w:tcPr>
+          <w:p>
+            <w:pPr>
+              <w:pStyle w:val="Compact"/>
+              <w:rPr>
+                <w:b w:val="0"/>
+                <w:sz w:val="17"/>
+              </w:rPr>
+            </w:pPr>
+            <w:r>
+              <w:rPr>
+                <w:b w:val="0"/>
+                <w:sz w:val="17"/>
+              </w:rPr>
+              <w:t>Role / why them</w:t>
+            </w:r>
+          </w:p>
+        </w:tc>
+        <w:tc>
+          <w:tcPr>
+            <w:tcW w:w="1667" w:type="pct"/>
+          </w:tcPr>
+          <w:p>
+            <w:pPr>
+              <w:pStyle w:val="Compact"/>
+              <w:rPr>
+                <w:b w:val="0"/>
+                <w:sz w:val="17"/>
+              </w:rPr>
+            </w:pPr>
+            <w:r>
+              <w:rPr>
+                <w:b w:val="0"/>
+                <w:sz w:val="17"/>
+              </w:rPr>
+              <w:t>Email</w:t>
+            </w:r>
+          </w:p>
+        </w:tc>
+      </w:tr>
+      <w:tr>
+        <w:trPr>
+          <w:cnfStyle w:val="000000100000" w:firstRow="0" w:lastRow="0" w:firstColumn="0" w:lastColumn="0" w:oddVBand="0" w:evenVBand="0" w:oddHBand="1" w:evenHBand="0" w:firstRowFirstColumn="0" w:firstRowLastColumn="0" w:lastRowFirstColumn="0" w:lastRowLastColumn="0"/>
+          <w:cantSplit/>
+        </w:trPr>
+        <w:tc>
+          <w:tcPr>
+            <w:tcW w:w="1667" w:type="pct"/>
+          </w:tcPr>
+          <w:p>
+            <w:pPr>
+              <w:pStyle w:val="Compact"/>
+              <w:rPr>
+                <w:sz w:val="17"/>
+              </w:rPr>
+            </w:pPr>
+            <w:r>
+              <w:rPr>
+                <w:b/>
+                <w:bCs/>
+                <w:sz w:val="17"/>
+              </w:rPr>
+              <w:t>Jason McConaghie</w:t>
+            </w:r>
+          </w:p>
+        </w:tc>
+        <w:tc>
+          <w:tcPr>
+            <w:tcW w:w="1667" w:type="pct"/>
+          </w:tcPr>
+          <w:p>
+            <w:pPr>
+              <w:pStyle w:val="Compact"/>
+              <w:rPr>
+                <w:sz w:val="17"/>
+              </w:rPr>
+            </w:pPr>
+            <w:r>
+              <w:rPr>
+                <w:sz w:val="17"/>
+              </w:rPr>
+              <w:t>Principal, ACI + IPDA board — the strongest single door into Edmonton IPD</w:t>
+            </w:r>
+          </w:p>
+        </w:tc>
+        <w:tc>
+          <w:tcPr>
+            <w:tcW w:w="1667" w:type="pct"/>
+          </w:tcPr>
+          <w:p>
+            <w:pPr>
+              <w:pStyle w:val="Compact"/>
+              <w:rPr>
+                <w:sz w:val="17"/>
+              </w:rPr>
+            </w:pPr>
+            <w:r>
+              <w:rPr>
+                <w:sz w:val="17"/>
+              </w:rPr>
+              <w:t xml:space="preserve">jmcconaghie@aci-arch.com </w:t>
+            </w:r>
+            <w:r>
+              <w:rPr>
+                <w:i/>
+                <w:iCs/>
+                <w:sz w:val="17"/>
+              </w:rPr>
+              <w:t>(verified)</w:t>
+            </w:r>
+          </w:p>
+        </w:tc>
+      </w:tr>
+      <w:tr>
+        <w:trPr>
+          <w:cantSplit/>
+        </w:trPr>
+        <w:tc>
+          <w:tcPr>
+            <w:tcW w:w="1667" w:type="pct"/>
+          </w:tcPr>
+          <w:p>
+            <w:pPr>
+              <w:pStyle w:val="Compact"/>
+              <w:rPr>
+                <w:sz w:val="17"/>
+              </w:rPr>
+            </w:pPr>
+            <w:r>
+              <w:rPr>
+                <w:b/>
+                <w:bCs/>
+                <w:sz w:val="17"/>
+              </w:rPr>
+              <w:t>Craig Webber</w:t>
+            </w:r>
+          </w:p>
+        </w:tc>
+        <w:tc>
+          <w:tcPr>
+            <w:tcW w:w="1667" w:type="pct"/>
+          </w:tcPr>
+          <w:p>
+            <w:pPr>
+              <w:pStyle w:val="Compact"/>
+              <w:rPr>
+                <w:sz w:val="17"/>
+              </w:rPr>
+            </w:pPr>
+            <w:r>
+              <w:rPr>
+                <w:sz w:val="17"/>
+              </w:rPr>
+              <w:t xml:space="preserve">Principal, Group2 — </w:t>
+            </w:r>
+            <w:r>
+              <w:rPr>
+                <w:b/>
+                <w:bCs/>
+                <w:sz w:val="17"/>
+              </w:rPr>
+              <w:t>Past President of the IPDA</w:t>
+            </w:r>
+            <w:r>
+              <w:rPr>
+                <w:sz w:val="17"/>
+              </w:rPr>
+              <w:t>; the most experienced IPD architect in Alberta</w:t>
+            </w:r>
+          </w:p>
+        </w:tc>
+        <w:tc>
+          <w:tcPr>
+            <w:tcW w:w="1667" w:type="pct"/>
+          </w:tcPr>
+          <w:p>
+            <w:pPr>
+              <w:pStyle w:val="Compact"/>
+              <w:rPr>
+                <w:sz w:val="17"/>
+              </w:rPr>
+            </w:pPr>
+            <w:r>
+              <w:rPr>
+                <w:sz w:val="17"/>
+              </w:rPr>
+              <w:t xml:space="preserve">craig.webber@group2.ca </w:t>
+            </w:r>
+            <w:r>
+              <w:rPr>
+                <w:i/>
+                <w:iCs/>
+                <w:sz w:val="17"/>
+              </w:rPr>
+              <w:t>(matches firm pattern; unconfirmed)</w:t>
+            </w:r>
+          </w:p>
+        </w:tc>
+      </w:tr>
+      <w:tr>
+        <w:trPr>
+          <w:cnfStyle w:val="000000100000" w:firstRow="0" w:lastRow="0" w:firstColumn="0" w:lastColumn="0" w:oddVBand="0" w:evenVBand="0" w:oddHBand="1" w:evenHBand="0" w:firstRowFirstColumn="0" w:firstRowLastColumn="0" w:lastRowFirstColumn="0" w:lastRowLastColumn="0"/>
+          <w:cantSplit/>
+        </w:trPr>
+        <w:tc>
+          <w:tcPr>
+            <w:tcW w:w="1667" w:type="pct"/>
+          </w:tcPr>
+          <w:p>
+            <w:pPr>
+              <w:pStyle w:val="Compact"/>
+              <w:rPr>
+                <w:sz w:val="17"/>
+              </w:rPr>
+            </w:pPr>
+            <w:r>
+              <w:rPr>
+                <w:b/>
+                <w:bCs/>
+                <w:sz w:val="17"/>
+              </w:rPr>
+              <w:t>Jen Hancock</w:t>
+            </w:r>
+          </w:p>
+        </w:tc>
+        <w:tc>
+          <w:tcPr>
+            <w:tcW w:w="1667" w:type="pct"/>
+          </w:tcPr>
+          <w:p>
+            <w:pPr>
+              <w:pStyle w:val="Compact"/>
+              <w:rPr>
+                <w:sz w:val="17"/>
+              </w:rPr>
+            </w:pPr>
+            <w:r>
+              <w:rPr>
+                <w:sz w:val="17"/>
+              </w:rPr>
+              <w:t>VP Collaborative Construction, Chandos — the field’s most visible practice leader</w:t>
+            </w:r>
+          </w:p>
+        </w:tc>
+        <w:tc>
+          <w:tcPr>
+            <w:tcW w:w="1667" w:type="pct"/>
+          </w:tcPr>
+          <w:p>
+            <w:pPr>
+              <w:pStyle w:val="Compact"/>
+              <w:rPr>
+                <w:sz w:val="17"/>
+              </w:rPr>
+            </w:pPr>
+            <w:r>
+              <w:rPr>
+                <w:sz w:val="17"/>
+              </w:rPr>
+              <w:t xml:space="preserve">jhancock@chandos.com </w:t>
+            </w:r>
+            <w:r>
+              <w:rPr>
+                <w:i/>
+                <w:iCs/>
+                <w:sz w:val="17"/>
+              </w:rPr>
+              <w:t>(inferred pattern, unconfirmed)</w:t>
+            </w:r>
+          </w:p>
+        </w:tc>
+      </w:tr>
+      <w:tr>
+        <w:trPr>
+          <w:cantSplit/>
+        </w:trPr>
+        <w:tc>
+          <w:tcPr>
+            <w:tcW w:w="1667" w:type="pct"/>
+          </w:tcPr>
+          <w:p>
+            <w:pPr>
+              <w:pStyle w:val="Compact"/>
+              <w:rPr>
+                <w:sz w:val="17"/>
+              </w:rPr>
+            </w:pPr>
+            <w:r>
+              <w:rPr>
+                <w:b/>
+                <w:bCs/>
+                <w:sz w:val="17"/>
+              </w:rPr>
+              <w:t>Lindsay Worton</w:t>
+            </w:r>
+          </w:p>
+        </w:tc>
+        <w:tc>
+          <w:tcPr>
+            <w:tcW w:w="1667" w:type="pct"/>
+          </w:tcPr>
+          <w:p>
+            <w:pPr>
+              <w:pStyle w:val="Compact"/>
+              <w:rPr>
+                <w:sz w:val="17"/>
+              </w:rPr>
+            </w:pPr>
+            <w:r>
+              <w:rPr>
+                <w:sz w:val="17"/>
+              </w:rPr>
+              <w:t>Chandos; IPDA Education Co-Chair</w:t>
+            </w:r>
+          </w:p>
+        </w:tc>
+        <w:tc>
+          <w:tcPr>
+            <w:tcW w:w="1667" w:type="pct"/>
+          </w:tcPr>
+          <w:p>
+            <w:pPr>
+              <w:pStyle w:val="Compact"/>
+              <w:rPr>
+                <w:sz w:val="17"/>
+              </w:rPr>
+            </w:pPr>
+            <w:r>
+              <w:rPr>
+                <w:sz w:val="17"/>
+              </w:rPr>
+              <w:t xml:space="preserve">lworton@chandos.com </w:t>
+            </w:r>
+            <w:r>
+              <w:rPr>
+                <w:i/>
+                <w:iCs/>
+                <w:sz w:val="17"/>
+              </w:rPr>
+              <w:t>(inferred pattern, unconfirmed)</w:t>
+            </w:r>
+          </w:p>
+        </w:tc>
+      </w:tr>
+      <w:tr>
+        <w:trPr>
+          <w:cnfStyle w:val="000000100000" w:firstRow="0" w:lastRow="0" w:firstColumn="0" w:lastColumn="0" w:oddVBand="0" w:evenVBand="0" w:oddHBand="1" w:evenHBand="0" w:firstRowFirstColumn="0" w:firstRowLastColumn="0" w:lastRowFirstColumn="0" w:lastRowLastColumn="0"/>
+          <w:cantSplit/>
+        </w:trPr>
+        <w:tc>
+          <w:tcPr>
+            <w:tcW w:w="1667" w:type="pct"/>
+          </w:tcPr>
+          <w:p>
+            <w:pPr>
+              <w:pStyle w:val="Compact"/>
+              <w:rPr>
+                <w:sz w:val="17"/>
+              </w:rPr>
+            </w:pPr>
+            <w:r>
+              <w:rPr>
+                <w:b/>
+                <w:bCs/>
+                <w:sz w:val="17"/>
+              </w:rPr>
+              <w:t>Padraig McCarthy</w:t>
+            </w:r>
+          </w:p>
+        </w:tc>
+        <w:tc>
+          <w:tcPr>
+            <w:tcW w:w="1667" w:type="pct"/>
+          </w:tcPr>
+          <w:p>
+            <w:pPr>
+              <w:pStyle w:val="Compact"/>
+              <w:rPr>
+                <w:sz w:val="17"/>
+              </w:rPr>
+            </w:pPr>
+            <w:r>
+              <w:rPr>
+                <w:sz w:val="17"/>
+              </w:rPr>
+              <w:t>VP &amp; District Manager Calgary, Chandos — natural pre-contact before the November conference</w:t>
+            </w:r>
+          </w:p>
+        </w:tc>
+        <w:tc>
+          <w:tcPr>
+            <w:tcW w:w="1667" w:type="pct"/>
+          </w:tcPr>
+          <w:p>
+            <w:pPr>
+              <w:pStyle w:val="Compact"/>
+              <w:rPr>
+                <w:sz w:val="17"/>
+              </w:rPr>
+            </w:pPr>
+            <w:r>
+              <w:rPr>
+                <w:sz w:val="17"/>
+              </w:rPr>
+              <w:t xml:space="preserve">pmccarthy@chandos.com </w:t>
+            </w:r>
+            <w:r>
+              <w:rPr>
+                <w:i/>
+                <w:iCs/>
+                <w:sz w:val="17"/>
+              </w:rPr>
+              <w:t>(verified)</w:t>
+            </w:r>
+          </w:p>
+        </w:tc>
+      </w:tr>
+      <w:tr>
+        <w:trPr>
+          <w:cantSplit/>
+        </w:trPr>
+        <w:tc>
+          <w:tcPr>
+            <w:tcW w:w="1667" w:type="pct"/>
+          </w:tcPr>
+          <w:p>
+            <w:pPr>
+              <w:pStyle w:val="Compact"/>
+              <w:rPr>
+                <w:sz w:val="17"/>
+              </w:rPr>
+            </w:pPr>
+            <w:r>
+              <w:rPr>
+                <w:b/>
+                <w:bCs/>
+                <w:sz w:val="17"/>
+              </w:rPr>
+              <w:t>D’Arcy Newberry</w:t>
+            </w:r>
+          </w:p>
+        </w:tc>
+        <w:tc>
+          <w:tcPr>
+            <w:tcW w:w="1667" w:type="pct"/>
+          </w:tcPr>
+          <w:p>
+            <w:pPr>
+              <w:pStyle w:val="Compact"/>
+              <w:rPr>
+                <w:sz w:val="17"/>
+              </w:rPr>
+            </w:pPr>
+            <w:r>
+              <w:rPr>
+                <w:sz w:val="17"/>
+              </w:rPr>
+              <w:t>SVP Strategic Operations, Chandos</w:t>
+            </w:r>
+          </w:p>
+        </w:tc>
+        <w:tc>
+          <w:tcPr>
+            <w:tcW w:w="1667" w:type="pct"/>
+          </w:tcPr>
+          <w:p>
+            <w:pPr>
+              <w:pStyle w:val="Compact"/>
+              <w:rPr>
+                <w:sz w:val="17"/>
+              </w:rPr>
+            </w:pPr>
+            <w:r>
+              <w:rPr>
+                <w:sz w:val="17"/>
+              </w:rPr>
+              <w:t xml:space="preserve">dnewberry@chandos.com </w:t>
+            </w:r>
+            <w:r>
+              <w:rPr>
+                <w:i/>
+                <w:iCs/>
+                <w:sz w:val="17"/>
+              </w:rPr>
+              <w:t>(verified)</w:t>
+            </w:r>
+          </w:p>
+        </w:tc>
+      </w:tr>
+      <w:tr>
+        <w:trPr>
+          <w:cnfStyle w:val="000000100000" w:firstRow="0" w:lastRow="0" w:firstColumn="0" w:lastColumn="0" w:oddVBand="0" w:evenVBand="0" w:oddHBand="1" w:evenHBand="0" w:firstRowFirstColumn="0" w:firstRowLastColumn="0" w:lastRowFirstColumn="0" w:lastRowLastColumn="0"/>
+          <w:cantSplit/>
+        </w:trPr>
+        <w:tc>
+          <w:tcPr>
+            <w:tcW w:w="1667" w:type="pct"/>
+          </w:tcPr>
+          <w:p>
+            <w:pPr>
+              <w:pStyle w:val="Compact"/>
+              <w:rPr>
+                <w:sz w:val="17"/>
+              </w:rPr>
+            </w:pPr>
+            <w:r>
+              <w:rPr>
+                <w:b/>
+                <w:bCs/>
+                <w:sz w:val="17"/>
+              </w:rPr>
+              <w:t>Glenn Cyrankiewicz</w:t>
+            </w:r>
+          </w:p>
+        </w:tc>
+        <w:tc>
+          <w:tcPr>
+            <w:tcW w:w="1667" w:type="pct"/>
+          </w:tcPr>
+          <w:p>
+            <w:pPr>
+              <w:pStyle w:val="Compact"/>
+              <w:rPr>
+                <w:sz w:val="17"/>
+              </w:rPr>
+            </w:pPr>
+            <w:r>
+              <w:rPr>
+                <w:sz w:val="17"/>
+              </w:rPr>
+              <w:t>CEO &amp; Principal, Delnor — the contractor that was itself once a first-time IPD entrant</w:t>
+            </w:r>
+          </w:p>
+        </w:tc>
+        <w:tc>
+          <w:tcPr>
+            <w:tcW w:w="1667" w:type="pct"/>
+          </w:tcPr>
+          <w:p>
+            <w:pPr>
+              <w:pStyle w:val="Compact"/>
+              <w:rPr>
+                <w:sz w:val="17"/>
+              </w:rPr>
+            </w:pPr>
+            <w:r>
+              <w:rPr>
+                <w:sz w:val="17"/>
+              </w:rPr>
+              <w:t xml:space="preserve">glennc@delnor.ca </w:t>
+            </w:r>
+            <w:r>
+              <w:rPr>
+                <w:i/>
+                <w:iCs/>
+                <w:sz w:val="17"/>
+              </w:rPr>
+              <w:t>(verified)</w:t>
+            </w:r>
+          </w:p>
+        </w:tc>
+      </w:tr>
+      <w:tr>
+        <w:trPr>
+          <w:cantSplit/>
+        </w:trPr>
+        <w:tc>
+          <w:tcPr>
+            <w:tcW w:w="1667" w:type="pct"/>
+          </w:tcPr>
+          <w:p>
+            <w:pPr>
+              <w:pStyle w:val="Compact"/>
+              <w:rPr>
+                <w:sz w:val="17"/>
+              </w:rPr>
+            </w:pPr>
+            <w:r>
+              <w:rPr>
+                <w:b/>
+                <w:bCs/>
+                <w:sz w:val="17"/>
+              </w:rPr>
+              <w:t>Paul Verhesen</w:t>
+            </w:r>
+          </w:p>
+        </w:tc>
+        <w:tc>
+          <w:tcPr>
+            <w:tcW w:w="1667" w:type="pct"/>
+          </w:tcPr>
+          <w:p>
+            <w:pPr>
+              <w:pStyle w:val="Compact"/>
+              <w:rPr>
+                <w:sz w:val="17"/>
+              </w:rPr>
+            </w:pPr>
+            <w:r>
+              <w:rPr>
+                <w:sz w:val="17"/>
+              </w:rPr>
+              <w:t>President, Clark Builders</w:t>
+            </w:r>
+          </w:p>
+        </w:tc>
+        <w:tc>
+          <w:tcPr>
+            <w:tcW w:w="1667" w:type="pct"/>
+          </w:tcPr>
+          <w:p>
+            <w:pPr>
+              <w:pStyle w:val="Compact"/>
+              <w:rPr>
+                <w:sz w:val="17"/>
+              </w:rPr>
+            </w:pPr>
+            <w:r>
+              <w:rPr>
+                <w:sz w:val="17"/>
+              </w:rPr>
+              <w:t xml:space="preserve">paul.verhesen@clarkbuilders.com </w:t>
+            </w:r>
+            <w:r>
+              <w:rPr>
+                <w:i/>
+                <w:iCs/>
+                <w:sz w:val="17"/>
+              </w:rPr>
+              <w:t>(verified)</w:t>
+            </w:r>
+          </w:p>
+        </w:tc>
+      </w:tr>
+      <w:tr>
+        <w:trPr>
+          <w:cnfStyle w:val="000000100000" w:firstRow="0" w:lastRow="0" w:firstColumn="0" w:lastColumn="0" w:oddVBand="0" w:evenVBand="0" w:oddHBand="1" w:evenHBand="0" w:firstRowFirstColumn="0" w:firstRowLastColumn="0" w:lastRowFirstColumn="0" w:lastRowLastColumn="0"/>
+          <w:cantSplit/>
+        </w:trPr>
+        <w:tc>
+          <w:tcPr>
+            <w:tcW w:w="1667" w:type="pct"/>
+          </w:tcPr>
+          <w:p>
+            <w:pPr>
+              <w:pStyle w:val="Compact"/>
+              <w:rPr>
+                <w:sz w:val="17"/>
+              </w:rPr>
+            </w:pPr>
+            <w:r>
+              <w:rPr>
+                <w:b/>
+                <w:bCs/>
+                <w:sz w:val="17"/>
+              </w:rPr>
+              <w:t>Avel Espiritu</w:t>
+            </w:r>
+          </w:p>
+        </w:tc>
+        <w:tc>
+          <w:tcPr>
+            <w:tcW w:w="1667" w:type="pct"/>
+          </w:tcPr>
+          <w:p>
+            <w:pPr>
+              <w:pStyle w:val="Compact"/>
+              <w:rPr>
+                <w:sz w:val="17"/>
+              </w:rPr>
+            </w:pPr>
+            <w:r>
+              <w:rPr>
+                <w:sz w:val="17"/>
+              </w:rPr>
+              <w:t>Host, Edmonton IPD Lean Coffee (free monthly meetup)</w:t>
+            </w:r>
+          </w:p>
+        </w:tc>
+        <w:tc>
+          <w:tcPr>
+            <w:tcW w:w="1667" w:type="pct"/>
+          </w:tcPr>
+          <w:p>
+            <w:pPr>
+              <w:pStyle w:val="Compact"/>
+              <w:rPr>
+                <w:sz w:val="17"/>
+              </w:rPr>
+            </w:pPr>
+            <w:r>
+              <w:rPr>
+                <w:sz w:val="17"/>
+              </w:rPr>
+              <w:t xml:space="preserve">avel@red-5.ca </w:t>
+            </w:r>
+            <w:r>
+              <w:rPr>
+                <w:i/>
+                <w:iCs/>
+                <w:sz w:val="17"/>
+              </w:rPr>
+              <w:t>(published)</w:t>
+            </w:r>
+          </w:p>
+        </w:tc>
+      </w:tr>
+    </w:tbl>
     <w:p>
       <w:pPr>
-        <w:pStyle w:val="Heading2"/>
-      </w:pPr>
-      <w:bookmarkStart w:id="6" w:name="bc-what-ipd-means-at-home-v-unless-noted"/>
-      <w:bookmarkEnd w:id="5"/>
-      <w:r>
-        <w:t>6. BC — what IPD means at home [V unless noted]</w:t>
+        <w:pStyle w:val="BodyText"/>
+      </w:pPr>
+      <w:r>
+        <w:t>Competitor contacts — RJC’s three regional IPD leads — are on file in KOR’s BD database with the same treatment; they are listed there for market awareness, not outreach.</w:t>
       </w:r>
     </w:p>
     <w:p>
@@ -3174,168 +3897,50 @@
           <w:b/>
           <w:bCs/>
         </w:rPr>
-        <w:t>True IPD in BC is rare: roughly 3–5 projects ever.</w:t>
-      </w:r>
-      <w:r>
-        <w:t xml:space="preserve"> Kamloops Canada Games Aquatic Centre (2019 — “BC’s first IPD”; WSP co-signed as an engineer party), 1st &amp; Clark Vancouver (BC Housing/City/VCH — reported as BC’s first CCDC 30, lower confidence), Burnaby Fire Halls #4 and #8 (</w:t>
-      </w:r>
-      <w:r>
-        <w:rPr>
-          <w:b/>
-          <w:bCs/>
-        </w:rPr>
-        <w:t>RJC structural</w:t>
-      </w:r>
-      <w:r>
-        <w:t>), and Penticton’s fire hall (</w:t>
-      </w:r>
-      <w:r>
-        <w:rPr>
-          <w:b/>
-          <w:bCs/>
-        </w:rPr>
-        <w:t>CCDC 30-2025, signed June 2026</w:t>
-      </w:r>
-      <w:r>
-        <w:t xml:space="preserve"> — Chandos again). Famous “BC IPD” </w:t>
-      </w:r>
-      <w:r>
-        <w:t>claims that failed verification: UBC Brock Commons (construction management), Cowichan Hospital (Alliance, not IPD).</w:t>
+        <w:t>How a first-timer gets in (documented cases):</w:t>
+      </w:r>
+      <w:r>
+        <w:t xml:space="preserve"> owners mandate IPD → the contractor/architect core cascade-selects consultants → selection interviews test collaborative behaviour and culture fit, not IPD résumé; </w:t>
+      </w:r>
+      <w:r>
+        <w:rPr>
+          <w:b/>
+          <w:bCs/>
+        </w:rPr>
+        <w:t>training comes after selection</w:t>
+      </w:r>
+      <w:r>
+        <w:t xml:space="preserve">. One Alberta RFP (Strathcona Fire Station 7) required the structural engineer named on the team at submission — meaning the relationship must exist </w:t>
+      </w:r>
+      <w:r>
+        <w:rPr>
+          <w:i/>
+          <w:iCs/>
+        </w:rPr>
+        <w:t>before</w:t>
+      </w:r>
+      <w:r>
+        <w:t xml:space="preserve"> the posting. The realistic KOR path: </w:t>
+      </w:r>
+      <w:r>
+        <w:rPr>
+          <w:b/>
+          <w:bCs/>
+        </w:rPr>
+        <w:t>APEGA Permit to Practice first</w:t>
+      </w:r>
+      <w:r>
+        <w:t xml:space="preserve"> (hard prerequisite, already on KOR’s Alberta list) → IPDA membership + Edmonton Lean Coffee presence → conventional work or genuine relationships with Chandos/Delnor/Clark and ACI/Group2 → be the seismic/mass-timber-capable option RJC isn’t when the next team forms.</w:t>
       </w:r>
     </w:p>
     <w:p>
       <w:pPr>
-        <w:pStyle w:val="Compact"/>
-        <w:numPr>
-          <w:ilvl w:val="0"/>
-          <w:numId w:val="5"/>
-        </w:numPr>
-      </w:pPr>
-      <w:r>
-        <w:rPr>
-          <w:b/>
-          <w:bCs/>
-        </w:rPr>
-        <w:t>The important BC fork for a structural engineer:</w:t>
-      </w:r>
-      <w:r>
-        <w:t xml:space="preserve"> in the </w:t>
-      </w:r>
-      <w:r>
-        <w:rPr>
-          <w:b/>
-          <w:bCs/>
-        </w:rPr>
-        <w:t>municipal IPD lane, owners procure the SE directly</w:t>
-      </w:r>
-      <w:r>
-        <w:t xml:space="preserve"> — Penticton posted a standalone “Structural Consultant: IPD” RFP, and Kamloops co-evaluated engineer proposals at the owner table. That is a door KOR can walk through without a sponsor. In the </w:t>
-      </w:r>
-      <w:r>
-        <w:rPr>
-          <w:b/>
-          <w:bCs/>
-        </w:rPr>
-        <w:t>health-capital Alliance lane</w:t>
-      </w:r>
-      <w:r>
-        <w:t xml:space="preserve"> </w:t>
-      </w:r>
-      <w:r>
-        <w:t xml:space="preserve">(Cowichan, Richmond, Burnaby — now the Province’s default for hospital megaprojects), the alliance agreement is bespoke (Australian-inspired, not CCDC 30), signatories stop at owner/contractor/architect, and </w:t>
-      </w:r>
-      <w:r>
-        <w:rPr>
-          <w:b/>
-          <w:bCs/>
-        </w:rPr>
-        <w:t>engineers do not sign</w:t>
-      </w:r>
-      <w:r>
-        <w:t xml:space="preserve"> </w:t>
-      </w:r>
-      <w:r>
-        <w:t xml:space="preserve">— the structural seat is reached through the GC/architect pursuit team before the RFQ, which is exactly the Prime-Consultant-shaped path in KOR’s existing playbook. A real 2024 alliance RFQ (Richmond Hospital) scored prior collaborative experience at only 20/100 — and key individuals’ résumés at 50/100. </w:t>
-      </w:r>
-      <w:r>
-        <w:rPr>
-          <w:b/>
-          <w:bCs/>
-        </w:rPr>
-        <w:t>No structural firm has been confirmed as a direct BC alliance signatory</w:t>
-      </w:r>
-      <w:r>
-        <w:t xml:space="preserve"> (architects have been).</w:t>
-      </w:r>
-    </w:p>
-    <w:p>
-      <w:pPr>
-        <w:pStyle w:val="Compact"/>
-        <w:numPr>
-          <w:ilvl w:val="0"/>
-          <w:numId w:val="5"/>
-        </w:numPr>
-      </w:pPr>
-      <w:r>
-        <w:rPr>
-          <w:b/>
-          <w:bCs/>
-        </w:rPr>
-        <w:t>Trajectory:</w:t>
-      </w:r>
-      <w:r>
-        <w:t xml:space="preserve"> growing, under the “Alliance” </w:t>
-      </w:r>
-      <w:r>
-        <w:t>name — Infrastructure BC’s own published alliance project count rose across its 2025 publications to roughly nine, spanning hospitals and highways [I — count assembled from IBC publications; the direction is solid, the exact tally less so], and it states it will continue using the model. Tempered by Budget 2026 capital re-pacing: Burnaby Hospital Phase 2 paused, the Fraser River Tunnel collaborative contract terminated. Next likely collaborative owners: VCH (Richmond Phases 2–3, construction 2026–29), North</w:t>
-      </w:r>
-      <w:r>
-        <w:t>ern Health (UHNBC), municipal fire halls (Vancouver Firehalls 2 and 9 — rumoured, UNVERIFIED), BC Housing. No standing contractor–architect alliances exist in BC, but repeat pursuit pairings are visible:</w:t>
-      </w:r>
-      <w:r>
-        <w:t xml:space="preserve"> </w:t>
-      </w:r>
-      <w:r>
-        <w:rPr>
-          <w:b/>
-          <w:bCs/>
-        </w:rPr>
-        <w:t>EllisDon+DIALOG</w:t>
-      </w:r>
-      <w:r>
-        <w:t>, EllisDon+Parkin/ZGF, and Chandos+Johnston Davidson.</w:t>
-      </w:r>
-    </w:p>
-    <w:p>
-      <w:pPr>
-        <w:pStyle w:val="Compact"/>
-        <w:numPr>
-          <w:ilvl w:val="0"/>
-          <w:numId w:val="5"/>
-        </w:numPr>
-      </w:pPr>
-      <w:r>
-        <w:rPr>
-          <w:b/>
-          <w:bCs/>
-        </w:rPr>
-        <w:t>Regulatory reality:</w:t>
-      </w:r>
-      <w:r>
-        <w:t xml:space="preserve"> EGBC has published nothing on IPD, alliances, or CCDC 30 (verified absence) — the only firm-level constant is the mandatory individual secondary-liability program (~$250K). There is no BC-specific legal commentary on the IPD insurance question at all; the closest is a Vancouver construction lawyer’s 2013 observation that alliance risks can be “difficult to insure.” </w:t>
-      </w:r>
-      <w:r>
-        <w:t>KOR would be working from first principles with its broker — like everyone else.</w:t>
-      </w:r>
-    </w:p>
-    <w:p>
-      <w:pPr>
         <w:pStyle w:val="Heading2"/>
       </w:pPr>
-      <w:bookmarkStart w:id="7" w:name="X6ab4b3100f097e3c14e128fec4e2da9dc68676d"/>
-      <w:bookmarkEnd w:id="6"/>
-      <w:r>
-        <w:t>7. The money and the risk — what KOR would actually sign up for [V unless noted]</w:t>
+      <w:bookmarkStart w:id="6" w:name="bc-what-ipd-means-at-home-v-unless-noted"/>
+      <w:bookmarkEnd w:id="5"/>
+      <w:r>
+        <w:t>6. BC — what IPD means at home [V unless noted]</w:t>
       </w:r>
     </w:p>
     <w:p>
@@ -3351,10 +3956,33 @@
           <w:b/>
           <w:bCs/>
         </w:rPr>
-        <w:t>Downside is capped but real:</w:t>
-      </w:r>
-      <w:r>
-        <w:t xml:space="preserve"> costs reimbursed, profit at risk. On an overrun — anyone’s overrun, fault-irrelevant — the shared profit pool drains toward zero. You can do excellent structural work and still earn nothing above cost because a trade partner blew its budget. That is the deal; it is also why teams pick partners so carefully.</w:t>
+        <w:t>True IPD in BC is rare: roughly 3–5 projects ever.</w:t>
+      </w:r>
+      <w:r>
+        <w:t xml:space="preserve"> Kamloops Canada Games Aquatic Centre (2019 — “BC’s first IPD”; WSP co-signed as an engineer party), 1st &amp; Clark Vancouver (BC Housing/City/VCH — reported as BC’s first CCDC 30, lower confidence), Burnaby Fire Halls #4 and #8 (</w:t>
+      </w:r>
+      <w:r>
+        <w:rPr>
+          <w:b/>
+          <w:bCs/>
+        </w:rPr>
+        <w:t>RJC structural</w:t>
+      </w:r>
+      <w:r>
+        <w:t>), and Penticton’s fire hall (</w:t>
+      </w:r>
+      <w:r>
+        <w:rPr>
+          <w:b/>
+          <w:bCs/>
+        </w:rPr>
+        <w:t>CCDC 30-2025, signed June 2026</w:t>
+      </w:r>
+      <w:r>
+        <w:t xml:space="preserve"> — Chandos again). Famous “BC IPD” </w:t>
+      </w:r>
+      <w:r>
+        <w:t>claims that failed verification: UBC Brock Commons (construction management), Cowichan Hospital (Alliance, not IPD).</w:t>
       </w:r>
     </w:p>
     <w:p>
@@ -3370,20 +3998,56 @@
           <w:b/>
           <w:bCs/>
         </w:rPr>
-        <w:t>The published record is good:</w:t>
-      </w:r>
-      <w:r>
-        <w:t xml:space="preserve"> every Canadian IPD study found paid the team its full profit; Mosaic Centre finished 12% under comparable market cost. </w:t>
-      </w:r>
-      <w:r>
-        <w:rPr>
-          <w:b/>
-          <w:bCs/>
-        </w:rPr>
-        <w:t>No published data isolates a structural engineer’s profit outcome on any Canadian IPD project</w:t>
-      </w:r>
-      <w:r>
-        <w:t xml:space="preserve"> — the claim “consultants do well in IPD” rests on team-level results and testimonials. [V for studies; the gap is the point]</w:t>
+        <w:t>The important BC fork for a structural engineer:</w:t>
+      </w:r>
+      <w:r>
+        <w:t xml:space="preserve"> in the </w:t>
+      </w:r>
+      <w:r>
+        <w:rPr>
+          <w:b/>
+          <w:bCs/>
+        </w:rPr>
+        <w:t>municipal IPD lane, owners procure the SE directly</w:t>
+      </w:r>
+      <w:r>
+        <w:t xml:space="preserve"> — Penticton posted a standalone “Structural Consultant: IPD” RFP, and Kamloops co-evaluated engineer proposals at the owner table. That is a door KOR can walk through without a sponsor. In the </w:t>
+      </w:r>
+      <w:r>
+        <w:rPr>
+          <w:b/>
+          <w:bCs/>
+        </w:rPr>
+        <w:t>health-capital Alliance lane</w:t>
+      </w:r>
+      <w:r>
+        <w:t xml:space="preserve"> </w:t>
+      </w:r>
+      <w:r>
+        <w:t xml:space="preserve">(Cowichan, Richmond, Burnaby — now the Province’s default for hospital megaprojects), the alliance agreement is bespoke (Australian-inspired, not CCDC 30), signatories stop at owner/contractor/architect, and </w:t>
+      </w:r>
+      <w:r>
+        <w:rPr>
+          <w:b/>
+          <w:bCs/>
+        </w:rPr>
+        <w:t>engineers do not sign</w:t>
+      </w:r>
+      <w:r>
+        <w:t xml:space="preserve"> </w:t>
+      </w:r>
+      <w:r>
+        <w:t xml:space="preserve">— the structural seat is reached through the GC/architect pursuit team before the RFQ, which is exactly the Prime-Consultant-shaped path in KOR’s existing playbook. A real 2024 alliance RFQ (Richmond Hospital) scored prior collaborative experience at only 20/100 — and key individuals’ résumés at 50/100. </w:t>
+      </w:r>
+      <w:r>
+        <w:rPr>
+          <w:b/>
+          <w:bCs/>
+        </w:rPr>
+        <w:t>No structural firm has been confirmed as a direct BC alliance signatory</w:t>
+      </w:r>
+      <w:r>
+        <w:t xml:space="preserve"> (architects have been).</w:t>
       </w:r>
     </w:p>
     <w:p>
@@ -3399,13 +4063,29 @@
           <w:b/>
           <w:bCs/>
         </w:rPr>
-        <w:t>Insurance needs real work before any signature:</w:t>
+        <w:t>Trajectory:</w:t>
+      </w:r>
+      <w:r>
+        <w:t xml:space="preserve"> growing, under the “Alliance” </w:t>
+      </w:r>
+      <w:r>
+        <w:t>name — Infrastructure BC’s own published alliance project count rose across its 2025 publications to roughly nine, spanning hospitals and highways [I — count assembled from IBC publications; the direction is solid, the exact tally less so], and it states it will continue using the model. Tempered by Budget 2026 capital re-pacing: Burnaby Hospital Phase 2 paused, the Fraser River Tunnel collaborative contract terminated. Next likely collaborative owners: VCH (Richmond Phases 2–3, construction 2026–29), North</w:t>
+      </w:r>
+      <w:r>
+        <w:t>ern Health (UHNBC), municipal fire halls (Vancouver Firehalls 2 and 9 — rumoured, UNVERIFIED), BC Housing. No standing contractor–architect alliances exist in BC, but repeat pursuit pairings are visible:</w:t>
       </w:r>
       <w:r>
         <w:t xml:space="preserve"> </w:t>
       </w:r>
       <w:r>
-        <w:t>standard E&amp;O has named IPD gaps (insured-vs-insured exclusions when parties share one contract; contractual-liability exclusions against the waiver regime; no cover for rectifying your own work). The documented fixes are project-specific professional liability policies or written carrier endorsements. An Aon executive has publicly flagged collaborative contracting “without the right insurance design” as an emerging industry risk. This is a broker conversation, not a form to sign.</w:t>
+        <w:rPr>
+          <w:b/>
+          <w:bCs/>
+        </w:rPr>
+        <w:t>EllisDon+DIALOG</w:t>
+      </w:r>
+      <w:r>
+        <w:t>, EllisDon+Parkin/ZGF, and Chandos+Johnston Davidson.</w:t>
       </w:r>
     </w:p>
     <w:p>
@@ -3421,37 +4101,23 @@
           <w:b/>
           <w:bCs/>
         </w:rPr>
-        <w:t>“Aligned incentives” is not</w:t>
-      </w:r>
-      <w:r>
-        <w:rPr>
-          <w:b/>
-          <w:bCs/>
-        </w:rPr>
-        <w:t xml:space="preserve"> “dispute-proof”:</w:t>
-      </w:r>
-      <w:r>
-        <w:t xml:space="preserve"> an IPD project reached the NWT Supreme Court in 2025 (</w:t>
-      </w:r>
-      <w:r>
-        <w:rPr>
-          <w:i/>
-          <w:iCs/>
-        </w:rPr>
-        <w:t>Onec Construction v. NWT Energy</w:t>
-      </w:r>
-      <w:r>
-        <w:t>), and a Saskatchewan IPD dispute went through arbitration and appeal. Rare, but the no-suit clause has edges.</w:t>
+        <w:t>Regulatory reality:</w:t>
+      </w:r>
+      <w:r>
+        <w:t xml:space="preserve"> EGBC has published nothing on IPD, alliances, or CCDC 30 (verified absence) — the only firm-level constant is the mandatory individual secondary-liability program (~$250K). There is no BC-specific legal commentary on the IPD insurance question at all; the closest is a Vancouver construction lawyer’s 2013 observation that alliance risks can be “difficult to insure.” </w:t>
+      </w:r>
+      <w:r>
+        <w:t>KOR would be working from first principles with its broker — like everyone else.</w:t>
       </w:r>
     </w:p>
     <w:p>
       <w:pPr>
         <w:pStyle w:val="Heading2"/>
       </w:pPr>
-      <w:bookmarkStart w:id="8" w:name="recommended-actions-dated"/>
-      <w:bookmarkEnd w:id="7"/>
-      <w:r>
-        <w:t>8. Recommended actions (dated)</w:t>
+      <w:bookmarkStart w:id="7" w:name="X6ab4b3100f097e3c14e128fec4e2da9dc68676d"/>
+      <w:bookmarkEnd w:id="6"/>
+      <w:r>
+        <w:t>7. The money and the risk — what KOR would actually sign up for [V unless noted]</w:t>
       </w:r>
     </w:p>
     <w:p>
@@ -3467,20 +4133,10 @@
           <w:b/>
           <w:bCs/>
         </w:rPr>
-        <w:t>Now:</w:t>
-      </w:r>
-      <w:r>
-        <w:t xml:space="preserve"> ask the person who raised IPD </w:t>
-      </w:r>
-      <w:r>
-        <w:rPr>
-          <w:b/>
-          <w:bCs/>
-        </w:rPr>
-        <w:t>which project or owner prompted the question</w:t>
-      </w:r>
-      <w:r>
-        <w:t xml:space="preserve"> — the Alberta club is small enough that the trigger is probably identifiable (the live items: Edmonton Fire Station 7 award, Strathcona Fieldhouse, King’s University, EPSB’s next bundle).</w:t>
+        <w:t>Downside is capped but real:</w:t>
+      </w:r>
+      <w:r>
+        <w:t xml:space="preserve"> costs reimbursed, profit at risk. On an overrun — anyone’s overrun, fault-irrelevant — the shared profit pool drains toward zero. You can do excellent structural work and still earn nothing above cost because a trade partner blew its budget. That is the deal; it is also why teams pick partners so carefully.</w:t>
       </w:r>
     </w:p>
     <w:p>
@@ -3496,10 +4152,20 @@
           <w:b/>
           <w:bCs/>
         </w:rPr>
-        <w:t>Now (cheap):</w:t>
-      </w:r>
-      <w:r>
-        <w:t xml:space="preserve"> buy CCDC 30 and its Schedule A and have a principal read them — every mechanic in this document should be verified against the actual text before KOR sits in any IPD interview. (~$100 from CCDC.)</w:t>
+        <w:t>The published record is good:</w:t>
+      </w:r>
+      <w:r>
+        <w:t xml:space="preserve"> every Canadian IPD study found paid the team its full profit; Mosaic Centre finished 12% under comparable market cost. </w:t>
+      </w:r>
+      <w:r>
+        <w:rPr>
+          <w:b/>
+          <w:bCs/>
+        </w:rPr>
+        <w:t>No published data isolates a structural engineer’s profit outcome on any Canadian IPD project</w:t>
+      </w:r>
+      <w:r>
+        <w:t xml:space="preserve"> — the claim “consultants do well in IPD” rests on team-level results and testimonials. [V for studies; the gap is the point]</w:t>
       </w:r>
     </w:p>
     <w:p>
@@ -3515,20 +4181,13 @@
           <w:b/>
           <w:bCs/>
         </w:rPr>
-        <w:t>July–August:</w:t>
-      </w:r>
-      <w:r>
-        <w:t xml:space="preserve"> progress the </w:t>
-      </w:r>
-      <w:r>
-        <w:rPr>
-          <w:b/>
-          <w:bCs/>
-        </w:rPr>
-        <w:t>APEGA Permit to Practice</w:t>
-      </w:r>
-      <w:r>
-        <w:t xml:space="preserve"> — it gates everything in Alberta, IPD included.</w:t>
+        <w:t>Insurance needs real work before any signature:</w:t>
+      </w:r>
+      <w:r>
+        <w:t xml:space="preserve"> </w:t>
+      </w:r>
+      <w:r>
+        <w:t>standard E&amp;O has named IPD gaps (insured-vs-insured exclusions when parties share one contract; contractual-liability exclusions against the waiver regime; no cover for rectifying your own work). The documented fixes are project-specific professional liability policies or written carrier endorsements. An Aon executive has publicly flagged collaborative contracting “without the right insurance design” as an emerging industry risk. This is a broker conversation, not a form to sign.</w:t>
       </w:r>
     </w:p>
     <w:p>
@@ -3544,30 +4203,37 @@
           <w:b/>
           <w:bCs/>
         </w:rPr>
-        <w:t>September:</w:t>
-      </w:r>
-      <w:r>
-        <w:t xml:space="preserve"> join </w:t>
-      </w:r>
-      <w:r>
-        <w:rPr>
-          <w:b/>
-          <w:bCs/>
-        </w:rPr>
-        <w:t>IPDA</w:t>
-      </w:r>
-      <w:r>
-        <w:t xml:space="preserve"> and start showing up at the </w:t>
-      </w:r>
-      <w:r>
-        <w:rPr>
-          <w:b/>
-          <w:bCs/>
-        </w:rPr>
-        <w:t>Edmonton Lean Coffee</w:t>
-      </w:r>
-      <w:r>
-        <w:t xml:space="preserve"> (free, monthly). Both RJC and DIALOG are already members; KOR’s absence is visible.</w:t>
+        <w:t>“Aligned incentives” is not</w:t>
+      </w:r>
+      <w:r>
+        <w:rPr>
+          <w:b/>
+          <w:bCs/>
+        </w:rPr>
+        <w:t xml:space="preserve"> “dispute-proof”:</w:t>
+      </w:r>
+      <w:r>
+        <w:t xml:space="preserve"> an IPD project reached the NWT Supreme Court in 2025 (</w:t>
+      </w:r>
+      <w:r>
+        <w:rPr>
+          <w:i/>
+          <w:iCs/>
+        </w:rPr>
+        <w:t>Onec Construction v. NWT Energy</w:t>
+      </w:r>
+      <w:r>
+        <w:t>), and a Saskatchewan IPD dispute went through arbitration and appeal. Rare, but the no-suit clause has edges.</w:t>
+      </w:r>
+    </w:p>
+    <w:p>
+      <w:pPr>
+        <w:pStyle w:val="Heading2"/>
+      </w:pPr>
+      <w:bookmarkStart w:id="8" w:name="recommended-actions-dated"/>
+      <w:bookmarkEnd w:id="7"/>
+      <w:r>
+        <w:t>8. Recommended actions (dated)</w:t>
       </w:r>
     </w:p>
     <w:p>
@@ -3575,7 +4241,7 @@
         <w:pStyle w:val="Compact"/>
         <w:numPr>
           <w:ilvl w:val="0"/>
-          <w:numId w:val="7"/>
+          <w:numId w:val="8"/>
         </w:numPr>
       </w:pPr>
       <w:r>
@@ -3583,10 +4249,20 @@
           <w:b/>
           <w:bCs/>
         </w:rPr>
-        <w:t>By early fall: register for the IPDA national conference — Calgary, Fairmont Palliser, November 3–4, 2026</w:t>
-      </w:r>
-      <w:r>
-        <w:t xml:space="preserve"> (pricing not yet posted — watch the conference page). One trip puts KOR in front of the entire Canadian IPD community, in Alberta, this cycle.</w:t>
+        <w:t>Now:</w:t>
+      </w:r>
+      <w:r>
+        <w:t xml:space="preserve"> ask the person who raised IPD </w:t>
+      </w:r>
+      <w:r>
+        <w:rPr>
+          <w:b/>
+          <w:bCs/>
+        </w:rPr>
+        <w:t>which project or owner prompted the question</w:t>
+      </w:r>
+      <w:r>
+        <w:t xml:space="preserve"> — the Alberta club is small enough that the trigger is probably identifiable (the live items: Edmonton Fire Station 7 award, Strathcona Fieldhouse, King’s University, EPSB’s next bundle).</w:t>
       </w:r>
     </w:p>
     <w:p>
@@ -3594,7 +4270,7 @@
         <w:pStyle w:val="Compact"/>
         <w:numPr>
           <w:ilvl w:val="0"/>
-          <w:numId w:val="7"/>
+          <w:numId w:val="8"/>
         </w:numPr>
       </w:pPr>
       <w:r>
@@ -3602,10 +4278,10 @@
           <w:b/>
           <w:bCs/>
         </w:rPr>
-        <w:t>Before any pursuit:</w:t>
-      </w:r>
-      <w:r>
-        <w:t xml:space="preserve"> broker conversation on E&amp;O vs project-specific cover for multi-party contracts (Section 7) — and price it into any IPD fee.</w:t>
+        <w:t>Now (cheap):</w:t>
+      </w:r>
+      <w:r>
+        <w:t xml:space="preserve"> buy CCDC 30 and its Schedule A and have a principal read them — every mechanic in this document should be verified against the actual text before KOR sits in any IPD interview. (~$100 from CCDC.)</w:t>
       </w:r>
     </w:p>
     <w:p>
@@ -3613,7 +4289,7 @@
         <w:pStyle w:val="Compact"/>
         <w:numPr>
           <w:ilvl w:val="0"/>
-          <w:numId w:val="7"/>
+          <w:numId w:val="8"/>
         </w:numPr>
       </w:pPr>
       <w:r>
@@ -3621,13 +4297,20 @@
           <w:b/>
           <w:bCs/>
         </w:rPr>
-        <w:t>Watch (Alberta):</w:t>
-      </w:r>
-      <w:r>
-        <w:t xml:space="preserve"> </w:t>
-      </w:r>
-      <w:r>
-        <w:t>Strathcona County’s Fire Station 7 IPD award (which structural engineer got the seat?); the Strathcona Fieldhouse SE identity; EPSB’s next school bundle.</w:t>
+        <w:t>July–August:</w:t>
+      </w:r>
+      <w:r>
+        <w:t xml:space="preserve"> progress the </w:t>
+      </w:r>
+      <w:r>
+        <w:rPr>
+          <w:b/>
+          <w:bCs/>
+        </w:rPr>
+        <w:t>APEGA Permit to Practice</w:t>
+      </w:r>
+      <w:r>
+        <w:t xml:space="preserve"> — it gates everything in Alberta, IPD included.</w:t>
       </w:r>
     </w:p>
     <w:p>
@@ -3635,7 +4318,7 @@
         <w:pStyle w:val="Compact"/>
         <w:numPr>
           <w:ilvl w:val="0"/>
-          <w:numId w:val="7"/>
+          <w:numId w:val="8"/>
         </w:numPr>
       </w:pPr>
       <w:r>
@@ -3643,24 +4326,123 @@
           <w:b/>
           <w:bCs/>
         </w:rPr>
-        <w:t>Watch (BC):</w:t>
-      </w:r>
-      <w:r>
-        <w:t xml:space="preserve"> municipal IPD postings — the Penticton precedent means </w:t>
-      </w:r>
-      <w:r>
-        <w:rPr>
-          <w:b/>
-          <w:bCs/>
-        </w:rPr>
-        <w:t>direct structural-engineer IPD RFPs now exist in BC</w:t>
-      </w:r>
-      <w:r>
-        <w:t>; and keep the health-alliance path running through architect relationships per the existing playbook (Richmond Phases 2–3 and UHNBC are the live ones).</w:t>
+        <w:t>September:</w:t>
+      </w:r>
+      <w:r>
+        <w:t xml:space="preserve"> join </w:t>
+      </w:r>
+      <w:r>
+        <w:rPr>
+          <w:b/>
+          <w:bCs/>
+        </w:rPr>
+        <w:t>IPDA</w:t>
+      </w:r>
+      <w:r>
+        <w:t xml:space="preserve"> and start showing up at the </w:t>
+      </w:r>
+      <w:r>
+        <w:rPr>
+          <w:b/>
+          <w:bCs/>
+        </w:rPr>
+        <w:t>Edmonton Lean Coffee</w:t>
+      </w:r>
+      <w:r>
+        <w:t xml:space="preserve"> (free, monthly). Both RJC and DIALOG are already members; KOR’s absence is visible.</w:t>
       </w:r>
     </w:p>
     <w:p>
       <w:pPr>
+        <w:pStyle w:val="Compact"/>
+        <w:numPr>
+          <w:ilvl w:val="0"/>
+          <w:numId w:val="8"/>
+        </w:numPr>
+      </w:pPr>
+      <w:r>
+        <w:rPr>
+          <w:b/>
+          <w:bCs/>
+        </w:rPr>
+        <w:t>By early fall: register for the IPDA national conference — Calgary, Fairmont Palliser, November 3–4, 2026</w:t>
+      </w:r>
+      <w:r>
+        <w:t xml:space="preserve"> (pricing not yet posted — watch the conference page). One trip puts KOR in front of the entire Canadian IPD community, in Alberta, this cycle.</w:t>
+      </w:r>
+    </w:p>
+    <w:p>
+      <w:pPr>
+        <w:pStyle w:val="Compact"/>
+        <w:numPr>
+          <w:ilvl w:val="0"/>
+          <w:numId w:val="8"/>
+        </w:numPr>
+      </w:pPr>
+      <w:r>
+        <w:rPr>
+          <w:b/>
+          <w:bCs/>
+        </w:rPr>
+        <w:t>Before any pursuit:</w:t>
+      </w:r>
+      <w:r>
+        <w:t xml:space="preserve"> broker conversation on E&amp;O vs project-specific cover for multi-party contracts (Section 7) — and price it into any IPD fee.</w:t>
+      </w:r>
+    </w:p>
+    <w:p>
+      <w:pPr>
+        <w:pStyle w:val="Compact"/>
+        <w:numPr>
+          <w:ilvl w:val="0"/>
+          <w:numId w:val="8"/>
+        </w:numPr>
+      </w:pPr>
+      <w:r>
+        <w:rPr>
+          <w:b/>
+          <w:bCs/>
+        </w:rPr>
+        <w:t>Watch (Alberta):</w:t>
+      </w:r>
+      <w:r>
+        <w:t xml:space="preserve"> </w:t>
+      </w:r>
+      <w:r>
+        <w:t>Strathcona County’s Fire Station 7 IPD award (which structural engineer got the seat?); the Strathcona Fieldhouse SE identity; EPSB’s next school bundle.</w:t>
+      </w:r>
+    </w:p>
+    <w:p>
+      <w:pPr>
+        <w:pStyle w:val="Compact"/>
+        <w:numPr>
+          <w:ilvl w:val="0"/>
+          <w:numId w:val="8"/>
+        </w:numPr>
+      </w:pPr>
+      <w:r>
+        <w:rPr>
+          <w:b/>
+          <w:bCs/>
+        </w:rPr>
+        <w:t>Watch (BC):</w:t>
+      </w:r>
+      <w:r>
+        <w:t xml:space="preserve"> municipal IPD postings — the Penticton precedent means </w:t>
+      </w:r>
+      <w:r>
+        <w:rPr>
+          <w:b/>
+          <w:bCs/>
+        </w:rPr>
+        <w:t>direct structural-engineer IPD RFPs now exist in BC</w:t>
+      </w:r>
+      <w:r>
+        <w:t>; and keep the health-alliance path running through architect relationships per the existing playbook (Richmond Phases 2–3 and UHNBC are the live ones).</w:t>
+      </w:r>
+    </w:p>
+    <w:p>
+      <w:pPr>
         <w:pStyle w:val="Heading2"/>
       </w:pPr>
       <w:bookmarkStart w:id="9" w:name="what-we-could-not-verify-open-items"/>
@@ -3682,7 +4464,7 @@
     </w:p>
     <w:p>
       <w:r>
-        <w:pict w14:anchorId="06009362">
+        <w:pict w14:anchorId="211E9168">
           <v:rect id="_x0000_i1026" style="width:0;height:1.5pt" o:hralign="center" o:hrstd="t" o:hr="t"/>
         </w:pict>
       </w:r>
@@ -3755,7 +4537,7 @@
   <w:abstractNum w:abstractNumId="0" w15:restartNumberingAfterBreak="0">
     <w:nsid w:val="0000A990"/>
     <w:multiLevelType w:val="multilevel"/>
-    <w:tmpl w:val="8EF61F92"/>
+    <w:tmpl w:val="86F87D74"/>
     <w:lvl w:ilvl="0">
       <w:numFmt w:val="bullet"/>
       <w:lvlText w:val=" "/>
@@ -3832,7 +4614,7 @@
   <w:abstractNum w:abstractNumId="1" w15:restartNumberingAfterBreak="0">
     <w:nsid w:val="0000A991"/>
     <w:multiLevelType w:val="multilevel"/>
-    <w:tmpl w:val="E3A4907E"/>
+    <w:tmpl w:val="2A7C458C"/>
     <w:lvl w:ilvl="0">
       <w:numFmt w:val="bullet"/>
       <w:lvlText w:val=""/>
@@ -3936,7 +4718,7 @@
   <w:abstractNum w:abstractNumId="2" w15:restartNumberingAfterBreak="0">
     <w:nsid w:val="00A99411"/>
     <w:multiLevelType w:val="multilevel"/>
-    <w:tmpl w:val="C986C74C"/>
+    <w:tmpl w:val="74E04C5E"/>
     <w:lvl w:ilvl="0">
       <w:start w:val="1"/>
       <w:numFmt w:val="decimal"/>
@@ -4019,10 +4801,10 @@
       </w:pPr>
     </w:lvl>
   </w:abstractNum>
-  <w:num w:numId="1" w16cid:durableId="691760814">
+  <w:num w:numId="1" w16cid:durableId="747188705">
     <w:abstractNumId w:val="0"/>
   </w:num>
-  <w:num w:numId="2" w16cid:durableId="2039889415">
+  <w:num w:numId="2" w16cid:durableId="1441874544">
     <w:abstractNumId w:val="2"/>
     <w:lvlOverride w:ilvl="0">
       <w:startOverride w:val="1"/>
@@ -4052,19 +4834,22 @@
       <w:startOverride w:val="1"/>
     </w:lvlOverride>
   </w:num>
-  <w:num w:numId="3" w16cid:durableId="1502037811">
+  <w:num w:numId="3" w16cid:durableId="1576208160">
     <w:abstractNumId w:val="1"/>
   </w:num>
-  <w:num w:numId="4" w16cid:durableId="1545798094">
+  <w:num w:numId="4" w16cid:durableId="403725271">
     <w:abstractNumId w:val="1"/>
   </w:num>
-  <w:num w:numId="5" w16cid:durableId="1340693811">
+  <w:num w:numId="5" w16cid:durableId="170488201">
     <w:abstractNumId w:val="1"/>
   </w:num>
-  <w:num w:numId="6" w16cid:durableId="16398233">
+  <w:num w:numId="6" w16cid:durableId="1066297711">
     <w:abstractNumId w:val="1"/>
   </w:num>
-  <w:num w:numId="7" w16cid:durableId="133838600">
+  <w:num w:numId="7" w16cid:durableId="1374886103">
+    <w:abstractNumId w:val="1"/>
+  </w:num>
+  <w:num w:numId="8" w16cid:durableId="181360692">
     <w:abstractNumId w:val="2"/>
     <w:lvlOverride w:ilvl="0">
       <w:startOverride w:val="1"/>
@@ -5328,7 +6113,7 @@
     <w:name w:val="Grid Table 4"/>
     <w:basedOn w:val="TableNormal"/>
     <w:uiPriority w:val="49"/>
-    <w:rsid w:val="00936431"/>
+    <w:rsid w:val="00874C80"/>
     <w:pPr>
       <w:spacing w:after="0"/>
     </w:pPr>

</xml_diff>

<commit_message>
docs(bd): IPD dossier final - all 9 call-list emails deliverability-verified
Hunter mailbox checks 2026-07-03: 8/9 deliverable score 100 (incl. the
3 previously pattern-inferred: Hancock, Worton, Webber); avel@red-5.ca
labeled published/catch-all. Platform EmailSource/Confidence updated.
This is the send copy.

Co-Authored-By: Claude Fable 5 <noreply@anthropic.com>
</commit_message>
<xml_diff>
--- a/docs/KOR-IPD-Alberta-BC-2026-07-03.docx
+++ b/docs/KOR-IPD-Alberta-BC-2026-07-03.docx
@@ -73,7 +73,7 @@
     </w:p>
     <w:p>
       <w:r>
-        <w:pict w14:anchorId="5C180903">
+        <w:pict w14:anchorId="1644A77E">
           <v:rect id="_x0000_i1025" style="width:0;height:1.5pt" o:hralign="center" o:hrstd="t" o:hr="t"/>
         </w:pict>
       </w:r>
@@ -3118,7 +3118,7 @@
         <w:t>The call list</w:t>
       </w:r>
       <w:r>
-        <w:t xml:space="preserve"> (contact details verified 2026-07-03 unless labeled; pattern-inferred addresses match each firm’s confirmed email format but are unconfirmed — verify before relying on them):</w:t>
+        <w:t xml:space="preserve"> — every address below passed a live mailbox deliverability check on 2026-07-03 (the one exception is labeled):</w:t>
       </w:r>
     </w:p>
     <w:tbl>
@@ -3268,15 +3268,7 @@
               <w:rPr>
                 <w:sz w:val="17"/>
               </w:rPr>
-              <w:t xml:space="preserve">jmcconaghie@aci-arch.com </w:t>
-            </w:r>
-            <w:r>
-              <w:rPr>
-                <w:i/>
-                <w:iCs/>
-                <w:sz w:val="17"/>
-              </w:rPr>
-              <w:t>(verified)</w:t>
+              <w:t>jmcconaghie@aci-arch.com</w:t>
             </w:r>
           </w:p>
         </w:tc>
@@ -3354,15 +3346,7 @@
               <w:rPr>
                 <w:sz w:val="17"/>
               </w:rPr>
-              <w:t xml:space="preserve">craig.webber@group2.ca </w:t>
-            </w:r>
-            <w:r>
-              <w:rPr>
-                <w:i/>
-                <w:iCs/>
-                <w:sz w:val="17"/>
-              </w:rPr>
-              <w:t>(matches firm pattern; unconfirmed)</w:t>
+              <w:t>craig.webber@group2.ca</w:t>
             </w:r>
           </w:p>
         </w:tc>
@@ -3427,15 +3411,7 @@
               <w:rPr>
                 <w:sz w:val="17"/>
               </w:rPr>
-              <w:t xml:space="preserve">jhancock@chandos.com </w:t>
-            </w:r>
-            <w:r>
-              <w:rPr>
-                <w:i/>
-                <w:iCs/>
-                <w:sz w:val="17"/>
-              </w:rPr>
-              <w:t>(inferred pattern, unconfirmed)</w:t>
+              <w:t>jhancock@chandos.com</w:t>
             </w:r>
           </w:p>
         </w:tc>
@@ -3499,15 +3475,7 @@
               <w:rPr>
                 <w:sz w:val="17"/>
               </w:rPr>
-              <w:t xml:space="preserve">lworton@chandos.com </w:t>
-            </w:r>
-            <w:r>
-              <w:rPr>
-                <w:i/>
-                <w:iCs/>
-                <w:sz w:val="17"/>
-              </w:rPr>
-              <w:t>(inferred pattern, unconfirmed)</w:t>
+              <w:t>lworton@chandos.com</w:t>
             </w:r>
           </w:p>
         </w:tc>
@@ -3572,15 +3540,7 @@
               <w:rPr>
                 <w:sz w:val="17"/>
               </w:rPr>
-              <w:t xml:space="preserve">pmccarthy@chandos.com </w:t>
-            </w:r>
-            <w:r>
-              <w:rPr>
-                <w:i/>
-                <w:iCs/>
-                <w:sz w:val="17"/>
-              </w:rPr>
-              <w:t>(verified)</w:t>
+              <w:t>pmccarthy@chandos.com</w:t>
             </w:r>
           </w:p>
         </w:tc>
@@ -3644,15 +3604,7 @@
               <w:rPr>
                 <w:sz w:val="17"/>
               </w:rPr>
-              <w:t xml:space="preserve">dnewberry@chandos.com </w:t>
-            </w:r>
-            <w:r>
-              <w:rPr>
-                <w:i/>
-                <w:iCs/>
-                <w:sz w:val="17"/>
-              </w:rPr>
-              <w:t>(verified)</w:t>
+              <w:t>dnewberry@chandos.com</w:t>
             </w:r>
           </w:p>
         </w:tc>
@@ -3717,15 +3669,7 @@
               <w:rPr>
                 <w:sz w:val="17"/>
               </w:rPr>
-              <w:t xml:space="preserve">glennc@delnor.ca </w:t>
-            </w:r>
-            <w:r>
-              <w:rPr>
-                <w:i/>
-                <w:iCs/>
-                <w:sz w:val="17"/>
-              </w:rPr>
-              <w:t>(verified)</w:t>
+              <w:t>glennc@delnor.ca</w:t>
             </w:r>
           </w:p>
         </w:tc>
@@ -3789,15 +3733,7 @@
               <w:rPr>
                 <w:sz w:val="17"/>
               </w:rPr>
-              <w:t xml:space="preserve">paul.verhesen@clarkbuilders.com </w:t>
-            </w:r>
-            <w:r>
-              <w:rPr>
-                <w:i/>
-                <w:iCs/>
-                <w:sz w:val="17"/>
-              </w:rPr>
-              <w:t>(verified)</w:t>
+              <w:t>paul.verhesen@clarkbuilders.com</w:t>
             </w:r>
           </w:p>
         </w:tc>
@@ -3870,7 +3806,7 @@
                 <w:iCs/>
                 <w:sz w:val="17"/>
               </w:rPr>
-              <w:t>(published)</w:t>
+              <w:t>(published by IPDA; domain accepts all mail so the check is inconclusive)</w:t>
             </w:r>
           </w:p>
         </w:tc>
@@ -4464,7 +4400,7 @@
     </w:p>
     <w:p>
       <w:r>
-        <w:pict w14:anchorId="211E9168">
+        <w:pict w14:anchorId="62DA5587">
           <v:rect id="_x0000_i1026" style="width:0;height:1.5pt" o:hralign="center" o:hrstd="t" o:hr="t"/>
         </w:pict>
       </w:r>
@@ -4537,7 +4473,7 @@
   <w:abstractNum w:abstractNumId="0" w15:restartNumberingAfterBreak="0">
     <w:nsid w:val="0000A990"/>
     <w:multiLevelType w:val="multilevel"/>
-    <w:tmpl w:val="86F87D74"/>
+    <w:tmpl w:val="6BFCFBEA"/>
     <w:lvl w:ilvl="0">
       <w:numFmt w:val="bullet"/>
       <w:lvlText w:val=" "/>
@@ -4614,7 +4550,7 @@
   <w:abstractNum w:abstractNumId="1" w15:restartNumberingAfterBreak="0">
     <w:nsid w:val="0000A991"/>
     <w:multiLevelType w:val="multilevel"/>
-    <w:tmpl w:val="2A7C458C"/>
+    <w:tmpl w:val="1598DBEA"/>
     <w:lvl w:ilvl="0">
       <w:numFmt w:val="bullet"/>
       <w:lvlText w:val=""/>
@@ -4718,7 +4654,7 @@
   <w:abstractNum w:abstractNumId="2" w15:restartNumberingAfterBreak="0">
     <w:nsid w:val="00A99411"/>
     <w:multiLevelType w:val="multilevel"/>
-    <w:tmpl w:val="74E04C5E"/>
+    <w:tmpl w:val="0DAE1E36"/>
     <w:lvl w:ilvl="0">
       <w:start w:val="1"/>
       <w:numFmt w:val="decimal"/>
@@ -4801,10 +4737,10 @@
       </w:pPr>
     </w:lvl>
   </w:abstractNum>
-  <w:num w:numId="1" w16cid:durableId="747188705">
+  <w:num w:numId="1" w16cid:durableId="650060134">
     <w:abstractNumId w:val="0"/>
   </w:num>
-  <w:num w:numId="2" w16cid:durableId="1441874544">
+  <w:num w:numId="2" w16cid:durableId="1989093268">
     <w:abstractNumId w:val="2"/>
     <w:lvlOverride w:ilvl="0">
       <w:startOverride w:val="1"/>
@@ -4834,22 +4770,22 @@
       <w:startOverride w:val="1"/>
     </w:lvlOverride>
   </w:num>
-  <w:num w:numId="3" w16cid:durableId="1576208160">
+  <w:num w:numId="3" w16cid:durableId="1327588381">
     <w:abstractNumId w:val="1"/>
   </w:num>
-  <w:num w:numId="4" w16cid:durableId="403725271">
+  <w:num w:numId="4" w16cid:durableId="1940990688">
     <w:abstractNumId w:val="1"/>
   </w:num>
-  <w:num w:numId="5" w16cid:durableId="170488201">
+  <w:num w:numId="5" w16cid:durableId="96298061">
     <w:abstractNumId w:val="1"/>
   </w:num>
-  <w:num w:numId="6" w16cid:durableId="1066297711">
+  <w:num w:numId="6" w16cid:durableId="811290971">
     <w:abstractNumId w:val="1"/>
   </w:num>
-  <w:num w:numId="7" w16cid:durableId="1374886103">
+  <w:num w:numId="7" w16cid:durableId="937756706">
     <w:abstractNumId w:val="1"/>
   </w:num>
-  <w:num w:numId="8" w16cid:durableId="181360692">
+  <w:num w:numId="8" w16cid:durableId="1013650811">
     <w:abstractNumId w:val="2"/>
     <w:lvlOverride w:ilvl="0">
       <w:startOverride w:val="1"/>
@@ -6113,7 +6049,7 @@
     <w:name w:val="Grid Table 4"/>
     <w:basedOn w:val="TableNormal"/>
     <w:uiPriority w:val="49"/>
-    <w:rsid w:val="00874C80"/>
+    <w:rsid w:val="007D52F1"/>
     <w:pPr>
       <w:spacing w:after="0"/>
     </w:pPr>

</xml_diff>